<commit_message>
updated module 4 homework pushed july 5th 2026
</commit_message>
<xml_diff>
--- a/module-4/Brandon Cox module 4 assignment 4.2.docx
+++ b/module-4/Brandon Cox module 4 assignment 4.2.docx
@@ -14,7 +14,13 @@
     </w:p>
     <w:p>
       <w:r>
-        <w:t xml:space="preserve"> July 7th, 2026</w:t>
+        <w:t xml:space="preserve"> July </w:t>
+      </w:r>
+      <w:r>
+        <w:t>5</w:t>
+      </w:r>
+      <w:r>
+        <w:t>th, 2026</w:t>
       </w:r>
     </w:p>
     <w:p/>
@@ -68,6 +74,29 @@
     </w:p>
     <w:p>
       <w:r>
+        <w:t>I messed up the date here and put the 7</w:t>
+      </w:r>
+      <w:r>
+        <w:rPr>
+          <w:vertAlign w:val="superscript"/>
+        </w:rPr>
+        <w:t>th</w:t>
+      </w:r>
+      <w:r>
+        <w:t xml:space="preserve"> instead of the 5</w:t>
+      </w:r>
+      <w:r>
+        <w:rPr>
+          <w:vertAlign w:val="superscript"/>
+        </w:rPr>
+        <w:t>th</w:t>
+      </w:r>
+      <w:r>
+        <w:t xml:space="preserve">. </w:t>
+      </w:r>
+    </w:p>
+    <w:p>
+      <w:r>
         <w:rPr>
           <w:noProof/>
         </w:rPr>
@@ -113,6 +142,19 @@
             </a:graphic>
           </wp:inline>
         </w:drawing>
+      </w:r>
+    </w:p>
+    <w:p>
+      <w:r>
+        <w:t xml:space="preserve">The date </w:t>
+      </w:r>
+      <w:proofErr w:type="gramStart"/>
+      <w:r>
+        <w:t>mess</w:t>
+      </w:r>
+      <w:proofErr w:type="gramEnd"/>
+      <w:r>
+        <w:t xml:space="preserve"> up continued with this flowchart as well</w:t>
       </w:r>
     </w:p>
     <w:sectPr>

</xml_diff>